<commit_message>
style: match the doc to Vanta's plain visual style
No logo, no color, big bold black section headings, no numbered
sections, no inline code formatting -- consistent with the other
Vanta-generated policy documents in compliance-information.
</commit_message>
<xml_diff>
--- a/docs/change-management-compensating-control-policy.docx
+++ b/docs/change-management-compensating-control-policy.docx
@@ -2,79 +2,13 @@
 <file path=word/document.xml><?xml version="1.0" encoding="utf-8"?>
 <w:document xmlns:w="http://schemas.openxmlformats.org/wordprocessingml/2006/main" xmlns:m="http://schemas.openxmlformats.org/officeDocument/2006/math" xmlns:r="http://schemas.openxmlformats.org/officeDocument/2006/relationships" xmlns:o="urn:schemas-microsoft-com:office:office" xmlns:v="urn:schemas-microsoft-com:vml" xmlns:w10="urn:schemas-microsoft-com:office:word" xmlns:a="http://schemas.openxmlformats.org/drawingml/2006/main" xmlns:pic="http://schemas.openxmlformats.org/drawingml/2006/picture" xmlns:wp="http://schemas.openxmlformats.org/drawingml/2006/wordprocessingDrawing">
   <w:body>
-    <w:bookmarkStart w:id="30" w:name="Xa87d0ae78e27604b8fddda94afa40d7cc159625"/>
+    <w:bookmarkStart w:id="30" w:name="Xed2f54c3f19f3852d07e5e87be027df1c116527"/>
     <w:p>
       <w:pPr>
         <w:pStyle w:val="Heading1"/>
       </w:pPr>
       <w:r>
-        <w:t xml:space="preserve">DeepFeat, Inc. — Change Management Compensating Control Policy</w:t>
-      </w:r>
-    </w:p>
-    <w:p>
-      <w:pPr>
-        <w:pStyle w:val="BlockText"/>
-      </w:pPr>
-      <w:r>
-        <w:rPr>
-          <w:bCs/>
-          <w:b/>
-        </w:rPr>
-        <w:t xml:space="preserve">Status:</w:t>
-      </w:r>
-      <w:r>
-        <w:t xml:space="preserve"> </w:t>
-      </w:r>
-      <w:r>
-        <w:t xml:space="preserve">Active policy. Documents the compensating control satisfying</w:t>
-      </w:r>
-      <w:r>
-        <w:t xml:space="preserve"> </w:t>
-      </w:r>
-      <w:r>
-        <w:t xml:space="preserve">SOC 2</w:t>
-      </w:r>
-      <w:r>
-        <w:t xml:space="preserve"> </w:t>
-      </w:r>
-      <w:r>
-        <w:rPr>
-          <w:rStyle w:val="VerbatimChar"/>
-        </w:rPr>
-        <w:t xml:space="preserve">CC8.1</w:t>
-      </w:r>
-      <w:r>
-        <w:t xml:space="preserve"> </w:t>
-      </w:r>
-      <w:r>
-        <w:t xml:space="preserve">(Change Management) and</w:t>
-      </w:r>
-      <w:r>
-        <w:t xml:space="preserve"> </w:t>
-      </w:r>
-      <w:r>
-        <w:rPr>
-          <w:rStyle w:val="VerbatimChar"/>
-        </w:rPr>
-        <w:t xml:space="preserve">CC5.2</w:t>
-      </w:r>
-      <w:r>
-        <w:t xml:space="preserve"> </w:t>
-      </w:r>
-      <w:r>
-        <w:t xml:space="preserve">(General Controls Over</w:t>
-      </w:r>
-      <w:r>
-        <w:t xml:space="preserve"> </w:t>
-      </w:r>
-      <w:r>
-        <w:t xml:space="preserve">Technology) during the period DeepFeat, Inc. operates with a single</w:t>
-      </w:r>
-      <w:r>
-        <w:t xml:space="preserve"> </w:t>
-      </w:r>
-      <w:r>
-        <w:t xml:space="preserve">engineer. Supersedes ad hoc practice as of the effective date below.</w:t>
+        <w:t xml:space="preserve">Change Management Compensating Control Policy</w:t>
       </w:r>
     </w:p>
     <w:p>
@@ -94,9 +28,11 @@
       <w:r>
         <w:t xml:space="preserve">Chief Technology Officer</w:t>
       </w:r>
-      <w:r>
-        <w:t xml:space="preserve"> </w:t>
-      </w:r>
+    </w:p>
+    <w:p>
+      <w:pPr>
+        <w:pStyle w:val="BodyText"/>
+      </w:pPr>
       <w:r>
         <w:rPr>
           <w:bCs/>
@@ -110,34 +46,23 @@
       <w:r>
         <w:t xml:space="preserve">2026-08-16</w:t>
       </w:r>
-      <w:r>
-        <w:t xml:space="preserve"> </w:t>
-      </w:r>
+    </w:p>
+    <w:p>
+      <w:pPr>
+        <w:pStyle w:val="BodyText"/>
+      </w:pPr>
       <w:r>
         <w:rPr>
           <w:bCs/>
           <w:b/>
         </w:rPr>
-        <w:t xml:space="preserve">Review cadence:</w:t>
-      </w:r>
-      <w:r>
-        <w:t xml:space="preserve"> </w:t>
-      </w:r>
-      <w:r>
-        <w:t xml:space="preserve">Revisit immediately upon hiring a second engineer, or</w:t>
-      </w:r>
-      <w:r>
-        <w:t xml:space="preserve"> </w:t>
-      </w:r>
-      <w:r>
-        <w:t xml:space="preserve">annually, whichever comes first.</w:t>
-      </w:r>
-    </w:p>
-    <w:p>
-      <w:r>
-        <w:pict>
-          <v:rect style="width:0;height:1.5pt" o:hralign="center" o:hrstd="t" o:hr="t"/>
-        </w:pict>
+        <w:t xml:space="preserve">Review Cadence:</w:t>
+      </w:r>
+      <w:r>
+        <w:t xml:space="preserve"> </w:t>
+      </w:r>
+      <w:r>
+        <w:t xml:space="preserve">Revisit immediately upon hiring a second engineer, or annually, whichever comes first.</w:t>
       </w:r>
     </w:p>
     <w:bookmarkStart w:id="20" w:name="purpose"/>
@@ -146,7 +71,7 @@
         <w:pStyle w:val="Heading2"/>
       </w:pPr>
       <w:r>
-        <w:t xml:space="preserve">1. Purpose</w:t>
+        <w:t xml:space="preserve">Purpose</w:t>
       </w:r>
     </w:p>
     <w:p>
@@ -154,37 +79,7 @@
         <w:pStyle w:val="FirstParagraph"/>
       </w:pPr>
       <w:r>
-        <w:t xml:space="preserve">SOC 2</w:t>
-      </w:r>
-      <w:r>
-        <w:t xml:space="preserve"> </w:t>
-      </w:r>
-      <w:r>
-        <w:rPr>
-          <w:rStyle w:val="VerbatimChar"/>
-        </w:rPr>
-        <w:t xml:space="preserve">CC8.1</w:t>
-      </w:r>
-      <w:r>
-        <w:t xml:space="preserve"> </w:t>
-      </w:r>
-      <w:r>
-        <w:t xml:space="preserve">and</w:t>
-      </w:r>
-      <w:r>
-        <w:t xml:space="preserve"> </w:t>
-      </w:r>
-      <w:r>
-        <w:rPr>
-          <w:rStyle w:val="VerbatimChar"/>
-        </w:rPr>
-        <w:t xml:space="preserve">CC5.2</w:t>
-      </w:r>
-      <w:r>
-        <w:t xml:space="preserve"> </w:t>
-      </w:r>
-      <w:r>
-        <w:t xml:space="preserve">expect that changes to production systems are</w:t>
+        <w:t xml:space="preserve">SOC 2 CC8.1 and CC5.2 expect that changes to production systems are</w:t>
       </w:r>
       <w:r>
         <w:t xml:space="preserve"> </w:t>
@@ -218,7 +113,7 @@
         <w:pStyle w:val="Heading2"/>
       </w:pPr>
       <w:r>
-        <w:t xml:space="preserve">2. The constraint</w:t>
+        <w:t xml:space="preserve">The constraint</w:t>
       </w:r>
     </w:p>
     <w:p>
@@ -286,7 +181,7 @@
         <w:pStyle w:val="Heading2"/>
       </w:pPr>
       <w:r>
-        <w:t xml:space="preserve">3. Why this control matters</w:t>
+        <w:t xml:space="preserve">Why this control matters</w:t>
       </w:r>
     </w:p>
     <w:p>
@@ -334,7 +229,7 @@
         <w:pStyle w:val="Heading2"/>
       </w:pPr>
       <w:r>
-        <w:t xml:space="preserve">4. The compensating control</w:t>
+        <w:t xml:space="preserve">The compensating control</w:t>
       </w:r>
     </w:p>
     <w:p>
@@ -357,7 +252,7 @@
         <w:pStyle w:val="Heading3"/>
       </w:pPr>
       <w:r>
-        <w:t xml:space="preserve">4.1 Automated review on every pull request</w:t>
+        <w:t xml:space="preserve">Automated review on every pull request</w:t>
       </w:r>
     </w:p>
     <w:p>
@@ -365,22 +260,7 @@
         <w:pStyle w:val="FirstParagraph"/>
       </w:pPr>
       <w:r>
-        <w:t xml:space="preserve">An AI-based review system (Claude, via the</w:t>
-      </w:r>
-      <w:r>
-        <w:t xml:space="preserve"> </w:t>
-      </w:r>
-      <w:r>
-        <w:rPr>
-          <w:rStyle w:val="VerbatimChar"/>
-        </w:rPr>
-        <w:t xml:space="preserve">DeepFeat/pr-governance</w:t>
-      </w:r>
-      <w:r>
-        <w:t xml:space="preserve"> </w:t>
-      </w:r>
-      <w:r>
-        <w:t xml:space="preserve">shared</w:t>
+        <w:t xml:space="preserve">An AI-based review system (Claude, via the DeepFeat/pr-governance shared</w:t>
       </w:r>
       <w:r>
         <w:t xml:space="preserve"> </w:t>
@@ -482,7 +362,7 @@
         <w:t xml:space="preserve"> </w:t>
       </w:r>
       <w:r>
-        <w:t xml:space="preserve">risk described in Section 3 — every</w:t>
+        <w:t xml:space="preserve">risk described above — every</w:t>
       </w:r>
       <w:r>
         <w:t xml:space="preserve"> </w:t>
@@ -494,7 +374,7 @@
         <w:t xml:space="preserve"> </w:t>
       </w:r>
       <w:r>
-        <w:t xml:space="preserve">for human judgment about business risk. That is the purpose of Section 4.2.</w:t>
+        <w:t xml:space="preserve">for human judgment about business risk. That is the purpose of the monthly human review described next.</w:t>
       </w:r>
     </w:p>
     <w:p>
@@ -543,7 +423,7 @@
         <w:pStyle w:val="Heading3"/>
       </w:pPr>
       <w:r>
-        <w:t xml:space="preserve">4.2 Monthly human review of material changes</w:t>
+        <w:t xml:space="preserve">Monthly human review of material changes</w:t>
       </w:r>
     </w:p>
     <w:p>
@@ -557,19 +437,7 @@
         <w:t xml:space="preserve"> </w:t>
       </w:r>
       <w:r>
-        <w:t xml:space="preserve">infrastructure are automatically labeled</w:t>
-      </w:r>
-      <w:r>
-        <w:t xml:space="preserve"> </w:t>
-      </w:r>
-      <w:r>
-        <w:rPr>
-          <w:rStyle w:val="VerbatimChar"/>
-        </w:rPr>
-        <w:t xml:space="preserve">security-relevant</w:t>
-      </w:r>
-      <w:r>
-        <w:t xml:space="preserve">. Once each</w:t>
+        <w:t xml:space="preserve">infrastructure are automatically labeled security-relevant. Once each</w:t>
       </w:r>
       <w:r>
         <w:t xml:space="preserve"> </w:t>
@@ -630,7 +498,7 @@
         <w:pStyle w:val="Heading2"/>
       </w:pPr>
       <w:r>
-        <w:t xml:space="preserve">5. Scope</w:t>
+        <w:t xml:space="preserve">Scope</w:t>
       </w:r>
     </w:p>
     <w:p>
@@ -654,7 +522,7 @@
         <w:pStyle w:val="Heading2"/>
       </w:pPr>
       <w:r>
-        <w:t xml:space="preserve">6. Historical exception</w:t>
+        <w:t xml:space="preserve">Historical exception</w:t>
       </w:r>
     </w:p>
     <w:p>
@@ -686,7 +554,7 @@
         <w:t xml:space="preserve"> </w:t>
       </w:r>
       <w:r>
-        <w:t xml:space="preserve">on or after 2026-08-16 are subject to the controls described in Section 4</w:t>
+        <w:t xml:space="preserve">on or after 2026-08-16 are subject to the controls described above</w:t>
       </w:r>
       <w:r>
         <w:t xml:space="preserve"> </w:t>
@@ -702,7 +570,7 @@
         <w:pStyle w:val="Heading2"/>
       </w:pPr>
       <w:r>
-        <w:t xml:space="preserve">7. Revision trigger</w:t>
+        <w:t xml:space="preserve">Revision trigger</w:t>
       </w:r>
     </w:p>
     <w:p>
@@ -710,7 +578,7 @@
         <w:pStyle w:val="FirstParagraph"/>
       </w:pPr>
       <w:r>
-        <w:t xml:space="preserve">Upon DeepFeat, Inc. hiring a second engineer, Section 4.1’s automated</w:t>
+        <w:t xml:space="preserve">Upon DeepFeat, Inc. hiring a second engineer, the automated review’s</w:t>
       </w:r>
       <w:r>
         <w:t xml:space="preserve"> </w:t>
@@ -757,54 +625,12 @@
         <w:pStyle w:val="Compact"/>
       </w:pPr>
       <w:r>
-        <w:t xml:space="preserve">Implementation:</w:t>
-      </w:r>
-      <w:r>
-        <w:t xml:space="preserve"> </w:t>
-      </w:r>
-      <w:r>
-        <w:rPr>
-          <w:rStyle w:val="VerbatimChar"/>
-        </w:rPr>
-        <w:t xml:space="preserve">DeepFeat/pr-governance</w:t>
-      </w:r>
-      <w:r>
-        <w:t xml:space="preserve"> </w:t>
-      </w:r>
-      <w:r>
-        <w:t xml:space="preserve">—</w:t>
-      </w:r>
-      <w:r>
-        <w:t xml:space="preserve"> </w:t>
-      </w:r>
-      <w:r>
-        <w:rPr>
-          <w:rStyle w:val="VerbatimChar"/>
-        </w:rPr>
-        <w:t xml:space="preserve">review.yml</w:t>
-      </w:r>
-      <w:r>
-        <w:t xml:space="preserve">,</w:t>
-      </w:r>
-      <w:r>
-        <w:t xml:space="preserve"> </w:t>
-      </w:r>
-      <w:r>
-        <w:rPr>
-          <w:rStyle w:val="VerbatimChar"/>
-        </w:rPr>
-        <w:t xml:space="preserve">auto-label.yml</w:t>
-      </w:r>
-      <w:r>
-        <w:t xml:space="preserve">,</w:t>
-      </w:r>
-      <w:r>
-        <w:t xml:space="preserve"> </w:t>
-      </w:r>
-      <w:r>
-        <w:rPr>
-          <w:rStyle w:val="VerbatimChar"/>
-        </w:rPr>
+        <w:t xml:space="preserve">Implementation: DeepFeat/pr-governance — review.yml, auto-label.yml,</w:t>
+      </w:r>
+      <w:r>
+        <w:t xml:space="preserve"> </w:t>
+      </w:r>
+      <w:r>
         <w:t xml:space="preserve">monthly-retro.yml</w:t>
       </w:r>
     </w:p>
@@ -835,9 +661,8 @@
     <w:bookmarkEnd w:id="29"/>
     <w:bookmarkEnd w:id="30"/>
     <w:sectPr>
-      <w:headerReference r:id="rId9" w:type="default"/>
-      <w:footerReference r:id="rId10" w:type="default"/>
-      <w:pgMar w:bottom="1440" w:footer="720" w:header="720" w:left="1440" w:right="1440" w:top="1872"/>
+      <w:footerReference r:id="rId9" w:type="default"/>
+      <w:pgMar w:bottom="1440" w:left="1440" w:right="1440" w:top="1440"/>
     </w:sectPr>
   </w:body>
 </w:document>
@@ -856,21 +681,8 @@
     </w:pPr>
     <w:r>
       <w:rPr>
-        <w:rFonts w:ascii="Calibri" w:hAnsi="Calibri"/>
-        <w:color w:val="64748B"/>
-        <w:sz w:val="16"/>
-      </w:rPr>
-      <w:t>DeepFeat, Inc. — Confidential — Internal Use Only</w:t>
-    </w:r>
-  </w:p>
-  <w:p>
-    <w:pPr>
-      <w:jc w:val="center"/>
-    </w:pPr>
-    <w:r>
-      <w:rPr>
-        <w:color w:val="64748B"/>
-        <w:sz w:val="16"/>
+        <w:color w:val="000000"/>
+        <w:sz w:val="20"/>
       </w:rPr>
       <w:fldChar w:fldCharType="begin"/>
       <w:instrText xml:space="preserve">PAGE</w:instrText>
@@ -898,65 +710,6 @@
     </w:p>
   </w:footnote>
 </w:footnotes>
-</file>
-
-<file path=word/header1.xml><?xml version="1.0" encoding="utf-8"?>
-<w:hdr xmlns:m="http://schemas.openxmlformats.org/officeDocument/2006/math" xmlns:mc="http://schemas.openxmlformats.org/markup-compatibility/2006" xmlns:mo="http://schemas.microsoft.com/office/mac/office/2008/main" xmlns:mv="urn:schemas-microsoft-com:mac:vml" xmlns:o="urn:schemas-microsoft-com:office:office" xmlns:r="http://schemas.openxmlformats.org/officeDocument/2006/relationships" xmlns:v="urn:schemas-microsoft-com:vml" xmlns:w10="urn:schemas-microsoft-com:office:word" xmlns:w14="http://schemas.microsoft.com/office/word/2010/wordml" xmlns:w="http://schemas.openxmlformats.org/wordprocessingml/2006/main" xmlns:wne="http://schemas.microsoft.com/office/word/2006/wordml" xmlns:wp14="http://schemas.microsoft.com/office/word/2010/wordprocessingDrawing" xmlns:wp="http://schemas.openxmlformats.org/drawingml/2006/wordprocessingDrawing" xmlns:wpc="http://schemas.microsoft.com/office/word/2010/wordprocessingCanvas" xmlns:wpg="http://schemas.microsoft.com/office/word/2010/wordprocessingGroup" xmlns:wpi="http://schemas.microsoft.com/office/word/2010/wordprocessingInk" xmlns:wps="http://schemas.microsoft.com/office/word/2010/wordprocessingShape" mc:Ignorable="w14 wp14">
-  <w:p>
-    <w:pPr>
-      <w:pStyle w:val="Header"/>
-      <w:jc w:val="right"/>
-    </w:pPr>
-    <w:r>
-      <w:drawing>
-        <wp:inline xmlns:a="http://schemas.openxmlformats.org/drawingml/2006/main" xmlns:pic="http://schemas.openxmlformats.org/drawingml/2006/picture">
-          <wp:extent cx="403642" cy="324000"/>
-          <wp:docPr id="1" name="Picture 1"/>
-          <wp:cNvGraphicFramePr>
-            <a:graphicFrameLocks noChangeAspect="1"/>
-          </wp:cNvGraphicFramePr>
-          <a:graphic>
-            <a:graphicData uri="http://schemas.openxmlformats.org/drawingml/2006/picture">
-              <pic:pic>
-                <pic:nvPicPr>
-                  <pic:cNvPr id="0" name="deepfeat-logo.png"/>
-                  <pic:cNvPicPr/>
-                </pic:nvPicPr>
-                <pic:blipFill>
-                  <a:blip r:embed="rId1"/>
-                  <a:stretch>
-                    <a:fillRect/>
-                  </a:stretch>
-                </pic:blipFill>
-                <pic:spPr>
-                  <a:xfrm>
-                    <a:off x="0" y="0"/>
-                    <a:ext cx="403642" cy="324000"/>
-                  </a:xfrm>
-                  <a:prstGeom prst="rect"/>
-                </pic:spPr>
-              </pic:pic>
-            </a:graphicData>
-          </a:graphic>
-        </wp:inline>
-      </w:drawing>
-    </w:r>
-  </w:p>
-  <w:p>
-    <w:pPr>
-      <w:jc w:val="right"/>
-    </w:pPr>
-    <w:r>
-      <w:rPr>
-        <w:rFonts w:ascii="Calibri" w:hAnsi="Calibri"/>
-        <w:b/>
-        <w:color w:val="0891B2"/>
-        <w:sz w:val="18"/>
-      </w:rPr>
-      <w:t>DeepFeat, Inc.</w:t>
-    </w:r>
-  </w:p>
-</w:hdr>
 </file>
 
 <file path=word/numbering.xml><?xml version="1.0" encoding="utf-8"?>
@@ -1144,11 +897,11 @@
     <w:name w:val="Normal"/>
     <w:qFormat/>
     <w:pPr>
-      <w:spacing w:after="160" w:line="276" w:lineRule="auto"/>
-    </w:pPr>
-    <w:rPr>
-      <w:rFonts w:ascii="Calibri" w:hAnsi="Calibri"/>
-      <w:color w:val="1E293B"/>
+      <w:spacing w:after="200" w:line="276" w:lineRule="auto"/>
+    </w:pPr>
+    <w:rPr>
+      <w:rFonts w:ascii="Arial" w:hAnsi="Arial"/>
+      <w:color w:val="000000"/>
       <w:sz w:val="22"/>
     </w:rPr>
   </w:style>
@@ -1183,15 +936,15 @@
     <w:pPr>
       <w:keepNext/>
       <w:keepLines/>
-      <w:spacing w:after="80" w:before="0"/>
+      <w:spacing w:after="240" w:before="480"/>
       <w:jc w:val="center"/>
     </w:pPr>
     <w:rPr>
-      <w:rFonts w:ascii="Calibri" w:asciiTheme="majorHAnsi" w:cstheme="majorBidi" w:eastAsiaTheme="majorEastAsia" w:hAnsi="Calibri" w:hAnsiTheme="majorHAnsi"/>
+      <w:rFonts w:asciiTheme="majorHAnsi" w:cstheme="majorBidi" w:eastAsiaTheme="majorEastAsia" w:hAnsiTheme="majorHAnsi"/>
       <w:b/>
       <w:bCs/>
-      <w:color w:val="1E293B"/>
-      <w:sz w:val="52"/>
+      <w:color w:themeColor="accent1" w:themeShade="B5" w:val="345A8A"/>
+      <w:sz w:val="36"/>
       <w:szCs w:val="36"/>
     </w:rPr>
   </w:style>
@@ -1282,15 +1035,15 @@
     <w:pPr>
       <w:keepNext/>
       <w:keepLines/>
-      <w:spacing w:after="160" w:before="440"/>
+      <w:spacing w:after="120" w:before="0"/>
       <w:outlineLvl w:val="0"/>
     </w:pPr>
     <w:rPr>
-      <w:rFonts w:ascii="Calibri" w:asciiTheme="majorHAnsi" w:cstheme="majorBidi" w:eastAsiaTheme="majorEastAsia" w:hAnsi="Calibri" w:hAnsiTheme="majorHAnsi"/>
+      <w:rFonts w:ascii="Arial" w:asciiTheme="majorHAnsi" w:cstheme="majorBidi" w:eastAsiaTheme="majorEastAsia" w:hAnsi="Arial" w:hAnsiTheme="majorHAnsi"/>
       <w:b/>
       <w:bCs/>
-      <w:color w:val="0891B2"/>
-      <w:sz w:val="34"/>
+      <w:color w:val="000000"/>
+      <w:sz w:val="22"/>
       <w:szCs w:val="32"/>
     </w:rPr>
   </w:style>
@@ -1304,15 +1057,15 @@
     <w:pPr>
       <w:keepNext/>
       <w:keepLines/>
-      <w:spacing w:after="120" w:before="320"/>
+      <w:spacing w:after="160" w:before="360"/>
       <w:outlineLvl w:val="1"/>
     </w:pPr>
     <w:rPr>
-      <w:rFonts w:ascii="Calibri" w:asciiTheme="majorHAnsi" w:cstheme="majorBidi" w:eastAsiaTheme="majorEastAsia" w:hAnsi="Calibri" w:hAnsiTheme="majorHAnsi"/>
+      <w:rFonts w:ascii="Arial" w:asciiTheme="majorHAnsi" w:cstheme="majorBidi" w:eastAsiaTheme="majorEastAsia" w:hAnsi="Arial" w:hAnsiTheme="majorHAnsi"/>
       <w:b/>
       <w:bCs/>
-      <w:color w:val="1E293B"/>
-      <w:sz w:val="27"/>
+      <w:color w:val="000000"/>
+      <w:sz w:val="48"/>
       <w:szCs w:val="28"/>
     </w:rPr>
   </w:style>
@@ -1326,16 +1079,15 @@
     <w:pPr>
       <w:keepNext/>
       <w:keepLines/>
-      <w:spacing w:after="80" w:before="240"/>
+      <w:spacing w:after="120" w:before="240"/>
       <w:outlineLvl w:val="2"/>
     </w:pPr>
     <w:rPr>
-      <w:rFonts w:ascii="Calibri" w:asciiTheme="majorHAnsi" w:cstheme="majorBidi" w:eastAsiaTheme="majorEastAsia" w:hAnsi="Calibri" w:hAnsiTheme="majorHAnsi"/>
+      <w:rFonts w:ascii="Arial" w:asciiTheme="majorHAnsi" w:cstheme="majorBidi" w:eastAsiaTheme="majorEastAsia" w:hAnsi="Arial" w:hAnsiTheme="majorHAnsi"/>
       <w:b/>
       <w:bCs/>
-      <w:i w:val="0"/>
-      <w:color w:val="64748B"/>
-      <w:sz w:val="23"/>
+      <w:color w:val="000000"/>
+      <w:sz w:val="28"/>
       <w:szCs w:val="24"/>
     </w:rPr>
   </w:style>
@@ -1471,13 +1223,13 @@
     <w:qFormat/>
     <w:pPr>
       <w:spacing w:after="200" w:before="100"/>
-      <w:ind w:firstLine="0" w:left="432" w:right="480"/>
-    </w:pPr>
-    <w:rPr>
-      <w:rFonts w:ascii="Calibri" w:hAnsi="Calibri"/>
-      <w:i/>
-      <w:color w:val="64748B"/>
-      <w:sz w:val="21"/>
+      <w:ind w:firstLine="0" w:left="0" w:right="480"/>
+    </w:pPr>
+    <w:rPr>
+      <w:rFonts w:ascii="Arial" w:hAnsi="Arial"/>
+      <w:i w:val="0"/>
+      <w:color w:val="000000"/>
+      <w:sz w:val="22"/>
     </w:rPr>
   </w:style>
   <w:style w:styleId="FootnoteText" w:type="paragraph">
@@ -1494,6 +1246,16 @@
     <w:unhideWhenUsed/>
   </w:style>
   <w:style w:default="1" w:styleId="Table" w:type="table">
+    <w:tblPr>
+      <w:tblBorders>
+        <w:top w:color="999999" w:space="0" w:sz="4" w:val="single"/>
+        <w:left w:color="999999" w:space="0" w:sz="4" w:val="single"/>
+        <w:bottom w:color="999999" w:space="0" w:sz="4" w:val="single"/>
+        <w:right w:color="999999" w:space="0" w:sz="4" w:val="single"/>
+        <w:insideH w:color="999999" w:space="0" w:sz="4" w:val="single"/>
+        <w:insideV w:color="999999" w:space="0" w:sz="4" w:val="single"/>
+      </w:tblBorders>
+    </w:tblPr>
     <w:name w:val="Table"/>
     <w:basedOn w:val="TableNormal"/>
     <w:semiHidden/>
@@ -1507,14 +1269,6 @@
         <w:bottom w:type="dxa" w:w="0"/>
         <w:right w:type="dxa" w:w="108"/>
       </w:tblCellMar>
-      <w:tblBorders>
-        <w:top w:color="B8C4CC" w:space="0" w:sz="4" w:val="single"/>
-        <w:left w:color="B8C4CC" w:space="0" w:sz="4" w:val="single"/>
-        <w:bottom w:color="B8C4CC" w:space="0" w:sz="4" w:val="single"/>
-        <w:right w:color="B8C4CC" w:space="0" w:sz="4" w:val="single"/>
-        <w:insideH w:color="B8C4CC" w:space="0" w:sz="4" w:val="single"/>
-        <w:insideV w:color="B8C4CC" w:space="0" w:sz="4" w:val="single"/>
-      </w:tblBorders>
     </w:tblPr>
     <w:tblStylePr w:type="firstRow">
       <w:tblPr>
@@ -1531,16 +1285,6 @@
         </w:tcBorders>
       </w:tcPr>
     </w:tblStylePr>
-    <w:tblStylePr w:type="firstRow">
-      <w:pPr/>
-      <w:rPr>
-        <w:b/>
-        <w:color w:val="FFFFFF"/>
-      </w:rPr>
-      <w:tcPr>
-        <w:shd w:color="auto" w:fill="0891B2" w:val="clear"/>
-      </w:tcPr>
-    </w:tblStylePr>
   </w:style>
   <w:style w:customStyle="1" w:styleId="DefinitionTerm" w:type="paragraph">
     <w:name w:val="Definition Term"/>
@@ -1620,7 +1364,8 @@
     <w:name w:val="Hyperlink"/>
     <w:basedOn w:val="BodyTextChar"/>
     <w:rPr>
-      <w:color w:val="0891B2"/>
+      <w:color w:val="000000"/>
+      <w:u w:val="single"/>
     </w:rPr>
   </w:style>
   <w:style w:styleId="TOCHeading" w:type="paragraph">

</xml_diff>

<commit_message>
docs: add Responsibility + Version/Author/Approver table, matching Vanta doc format
</commit_message>
<xml_diff>
--- a/docs/change-management-compensating-control-policy.docx
+++ b/docs/change-management-compensating-control-policy.docx
@@ -2,7 +2,7 @@
 <file path=word/document.xml><?xml version="1.0" encoding="utf-8"?>
 <w:document xmlns:w="http://schemas.openxmlformats.org/wordprocessingml/2006/main" xmlns:m="http://schemas.openxmlformats.org/officeDocument/2006/math" xmlns:r="http://schemas.openxmlformats.org/officeDocument/2006/relationships" xmlns:o="urn:schemas-microsoft-com:office:office" xmlns:v="urn:schemas-microsoft-com:vml" xmlns:w10="urn:schemas-microsoft-com:office:word" xmlns:a="http://schemas.openxmlformats.org/drawingml/2006/main" xmlns:pic="http://schemas.openxmlformats.org/drawingml/2006/picture" xmlns:wp="http://schemas.openxmlformats.org/drawingml/2006/wordprocessingDrawing">
   <w:body>
-    <w:bookmarkStart w:id="30" w:name="Xed2f54c3f19f3852d07e5e87be027df1c116527"/>
+    <w:bookmarkStart w:id="32" w:name="Xed2f54c3f19f3852d07e5e87be027df1c116527"/>
     <w:p>
       <w:pPr>
         <w:pStyle w:val="Heading1"/>
@@ -659,7 +659,183 @@
       </w:r>
     </w:p>
     <w:bookmarkEnd w:id="29"/>
+    <w:bookmarkStart w:id="30" w:name="responsibility"/>
+    <w:p>
+      <w:pPr>
+        <w:pStyle w:val="Heading2"/>
+      </w:pPr>
+      <w:r>
+        <w:t xml:space="preserve">Responsibility</w:t>
+      </w:r>
+    </w:p>
+    <w:p>
+      <w:pPr>
+        <w:pStyle w:val="FirstParagraph"/>
+      </w:pPr>
+      <w:r>
+        <w:t xml:space="preserve">It is the Chief Technology Officer’s responsibility to ensure this policy</w:t>
+      </w:r>
+      <w:r>
+        <w:t xml:space="preserve"> </w:t>
+      </w:r>
+      <w:r>
+        <w:t xml:space="preserve">is followed.</w:t>
+      </w:r>
+    </w:p>
     <w:bookmarkEnd w:id="30"/>
+    <w:bookmarkStart w:id="31" w:name="version"/>
+    <w:p>
+      <w:pPr>
+        <w:pStyle w:val="Heading2"/>
+      </w:pPr>
+      <w:r>
+        <w:t xml:space="preserve">Version</w:t>
+      </w:r>
+    </w:p>
+    <w:tbl>
+      <w:tblPr>
+        <w:tblStyle w:val="Table"/>
+        <w:tblW w:type="pct" w:w="5000"/>
+        <w:tblLook w:firstRow="1" w:lastRow="0" w:firstColumn="0" w:lastColumn="0" w:noHBand="0" w:noVBand="0" w:val="0020"/>
+        <w:jc w:val="start"/>
+      </w:tblPr>
+      <w:tblGrid>
+        <w:gridCol w:w="1584"/>
+        <w:gridCol w:w="1584"/>
+        <w:gridCol w:w="1584"/>
+        <w:gridCol w:w="1584"/>
+        <w:gridCol w:w="1584"/>
+      </w:tblGrid>
+      <w:tr>
+        <w:trPr>
+          <w:tblHeader w:val="true"/>
+        </w:trPr>
+        <w:tc>
+          <w:tcPr/>
+          <w:p>
+            <w:pPr>
+              <w:pStyle w:val="Compact"/>
+              <w:jc w:val="left"/>
+            </w:pPr>
+            <w:r>
+              <w:t xml:space="preserve">Version</w:t>
+            </w:r>
+          </w:p>
+        </w:tc>
+        <w:tc>
+          <w:tcPr/>
+          <w:p>
+            <w:pPr>
+              <w:pStyle w:val="Compact"/>
+              <w:jc w:val="left"/>
+            </w:pPr>
+            <w:r>
+              <w:t xml:space="preserve">Date</w:t>
+            </w:r>
+          </w:p>
+        </w:tc>
+        <w:tc>
+          <w:tcPr/>
+          <w:p>
+            <w:pPr>
+              <w:pStyle w:val="Compact"/>
+              <w:jc w:val="left"/>
+            </w:pPr>
+            <w:r>
+              <w:t xml:space="preserve">Description</w:t>
+            </w:r>
+          </w:p>
+        </w:tc>
+        <w:tc>
+          <w:tcPr/>
+          <w:p>
+            <w:pPr>
+              <w:pStyle w:val="Compact"/>
+              <w:jc w:val="left"/>
+            </w:pPr>
+            <w:r>
+              <w:t xml:space="preserve">Author</w:t>
+            </w:r>
+          </w:p>
+        </w:tc>
+        <w:tc>
+          <w:tcPr/>
+          <w:p>
+            <w:pPr>
+              <w:pStyle w:val="Compact"/>
+              <w:jc w:val="left"/>
+            </w:pPr>
+            <w:r>
+              <w:t xml:space="preserve">Approved by</w:t>
+            </w:r>
+          </w:p>
+        </w:tc>
+      </w:tr>
+      <w:tr>
+        <w:tc>
+          <w:tcPr/>
+          <w:p>
+            <w:pPr>
+              <w:pStyle w:val="Compact"/>
+              <w:jc w:val="left"/>
+            </w:pPr>
+            <w:r>
+              <w:t xml:space="preserve">1.0</w:t>
+            </w:r>
+          </w:p>
+        </w:tc>
+        <w:tc>
+          <w:tcPr/>
+          <w:p>
+            <w:pPr>
+              <w:pStyle w:val="Compact"/>
+              <w:jc w:val="left"/>
+            </w:pPr>
+            <w:r>
+              <w:t xml:space="preserve">2026-08-16</w:t>
+            </w:r>
+          </w:p>
+        </w:tc>
+        <w:tc>
+          <w:tcPr/>
+          <w:p>
+            <w:pPr>
+              <w:pStyle w:val="Compact"/>
+              <w:jc w:val="left"/>
+            </w:pPr>
+            <w:r>
+              <w:t xml:space="preserve">Initial version</w:t>
+            </w:r>
+          </w:p>
+        </w:tc>
+        <w:tc>
+          <w:tcPr/>
+          <w:p>
+            <w:pPr>
+              <w:pStyle w:val="Compact"/>
+              <w:jc w:val="left"/>
+            </w:pPr>
+            <w:r>
+              <w:t xml:space="preserve">Chief Technology Officer</w:t>
+            </w:r>
+          </w:p>
+        </w:tc>
+        <w:tc>
+          <w:tcPr/>
+          <w:p>
+            <w:pPr>
+              <w:pStyle w:val="Compact"/>
+              <w:jc w:val="left"/>
+            </w:pPr>
+            <w:r>
+              <w:t xml:space="preserve">Chief Executive Officer</w:t>
+            </w:r>
+          </w:p>
+        </w:tc>
+      </w:tr>
+    </w:tbl>
+    <w:bookmarkEnd w:id="31"/>
+    <w:bookmarkEnd w:id="32"/>
     <w:sectPr>
       <w:footerReference r:id="rId9" w:type="default"/>
       <w:pgMar w:bottom="1440" w:left="1440" w:right="1440" w:top="1440"/>

</xml_diff>

<commit_message>
docs: drop Cross-references section, restore Responsibility+Version, carry forward wording edits
</commit_message>
<xml_diff>
--- a/docs/change-management-compensating-control-policy.docx
+++ b/docs/change-management-compensating-control-policy.docx
@@ -2,7 +2,7 @@
 <file path=word/document.xml><?xml version="1.0" encoding="utf-8"?>
 <w:document xmlns:w="http://schemas.openxmlformats.org/wordprocessingml/2006/main" xmlns:m="http://schemas.openxmlformats.org/officeDocument/2006/math" xmlns:r="http://schemas.openxmlformats.org/officeDocument/2006/relationships" xmlns:o="urn:schemas-microsoft-com:office:office" xmlns:v="urn:schemas-microsoft-com:vml" xmlns:w10="urn:schemas-microsoft-com:office:word" xmlns:a="http://schemas.openxmlformats.org/drawingml/2006/main" xmlns:pic="http://schemas.openxmlformats.org/drawingml/2006/picture" xmlns:wp="http://schemas.openxmlformats.org/drawingml/2006/wordprocessingDrawing">
   <w:body>
-    <w:bookmarkStart w:id="32" w:name="Xed2f54c3f19f3852d07e5e87be027df1c116527"/>
+    <w:bookmarkStart w:id="31" w:name="Xed2f54c3f19f3852d07e5e87be027df1c116527"/>
     <w:p>
       <w:pPr>
         <w:pStyle w:val="Heading1"/>
@@ -260,25 +260,19 @@
         <w:pStyle w:val="FirstParagraph"/>
       </w:pPr>
       <w:r>
-        <w:t xml:space="preserve">An AI-based review system (Claude, via the DeepFeat/pr-governance shared</w:t>
-      </w:r>
-      <w:r>
-        <w:t xml:space="preserve"> </w:t>
-      </w:r>
-      <w:r>
-        <w:t xml:space="preserve">workflow) reviews every pull request against the target repository’s</w:t>
-      </w:r>
-      <w:r>
-        <w:t xml:space="preserve"> </w:t>
-      </w:r>
-      <w:r>
-        <w:t xml:space="preserve">stated engineering conventions, checking for defects, security issues, and</w:t>
-      </w:r>
-      <w:r>
-        <w:t xml:space="preserve"> </w:t>
-      </w:r>
-      <w:r>
-        <w:t xml:space="preserve">missing test coverage. The system submits a</w:t>
+        <w:t xml:space="preserve">An AI-based review system reviews every pull request against the target</w:t>
+      </w:r>
+      <w:r>
+        <w:t xml:space="preserve"> </w:t>
+      </w:r>
+      <w:r>
+        <w:t xml:space="preserve">repository’s stated engineering conventions, checking for defects, security</w:t>
+      </w:r>
+      <w:r>
+        <w:t xml:space="preserve"> </w:t>
+      </w:r>
+      <w:r>
+        <w:t xml:space="preserve">issues, and missing test coverage. The system submits a</w:t>
       </w:r>
       <w:r>
         <w:t xml:space="preserve"> </w:t>
@@ -288,7 +282,7 @@
           <w:bCs/>
           <w:b/>
         </w:rPr>
-        <w:t xml:space="preserve">formal GitHub pull request</w:t>
+        <w:t xml:space="preserve">formal GitHub</w:t>
       </w:r>
       <w:r>
         <w:rPr>
@@ -302,13 +296,13 @@
           <w:bCs/>
           <w:b/>
         </w:rPr>
-        <w:t xml:space="preserve">review</w:t>
-      </w:r>
-      <w:r>
-        <w:t xml:space="preserve"> </w:t>
-      </w:r>
-      <w:r>
-        <w:t xml:space="preserve">— an approval or a request for changes — not merely a comment.</w:t>
+        <w:t xml:space="preserve">pull request review</w:t>
+      </w:r>
+      <w:r>
+        <w:t xml:space="preserve"> </w:t>
+      </w:r>
+      <w:r>
+        <w:t xml:space="preserve">with an approval or a request for changes.</w:t>
       </w:r>
     </w:p>
     <w:p>
@@ -362,13 +356,13 @@
         <w:t xml:space="preserve"> </w:t>
       </w:r>
       <w:r>
-        <w:t xml:space="preserve">risk described above — every</w:t>
-      </w:r>
-      <w:r>
-        <w:t xml:space="preserve"> </w:t>
-      </w:r>
-      <w:r>
-        <w:t xml:space="preserve">change has a recorded, non-author approver — but it does not substitute</w:t>
+        <w:t xml:space="preserve">risk described above such that every</w:t>
+      </w:r>
+      <w:r>
+        <w:t xml:space="preserve"> </w:t>
+      </w:r>
+      <w:r>
+        <w:t xml:space="preserve">change has a recorded, non-author approver, but it does not substitute</w:t>
       </w:r>
       <w:r>
         <w:t xml:space="preserve"> </w:t>
@@ -457,7 +451,7 @@
         <w:pStyle w:val="BodyText"/>
       </w:pPr>
       <w:r>
-        <w:t xml:space="preserve">This review is conducted at the level of business risk — confirming the</w:t>
+        <w:t xml:space="preserve">This review is conducted at the level of business risk confirming the</w:t>
       </w:r>
       <w:r>
         <w:t xml:space="preserve"> </w:t>
@@ -469,7 +463,7 @@
         <w:t xml:space="preserve"> </w:t>
       </w:r>
       <w:r>
-        <w:t xml:space="preserve">DeepFeat, Inc.’s obligations to its customers — rather than a technical</w:t>
+        <w:t xml:space="preserve">DeepFeat, Inc.’s obligations to its customers, rather than a technical</w:t>
       </w:r>
       <w:r>
         <w:t xml:space="preserve"> </w:t>
@@ -599,91 +593,32 @@
         <w:t xml:space="preserve">approving reviewer of record. This policy must be revised at that time.</w:t>
       </w:r>
     </w:p>
-    <w:p>
-      <w:r>
-        <w:pict>
-          <v:rect style="width:0;height:1.5pt" o:hralign="center" o:hrstd="t" o:hr="t"/>
-        </w:pict>
-      </w:r>
-    </w:p>
     <w:bookmarkEnd w:id="28"/>
-    <w:bookmarkStart w:id="29" w:name="cross-references"/>
+    <w:bookmarkStart w:id="29" w:name="responsibility"/>
     <w:p>
       <w:pPr>
         <w:pStyle w:val="Heading2"/>
       </w:pPr>
       <w:r>
-        <w:t xml:space="preserve">Cross-references</w:t>
-      </w:r>
-    </w:p>
-    <w:p>
-      <w:pPr>
-        <w:numPr>
-          <w:ilvl w:val="0"/>
-          <w:numId w:val="1001"/>
-        </w:numPr>
-        <w:pStyle w:val="Compact"/>
-      </w:pPr>
-      <w:r>
-        <w:t xml:space="preserve">Implementation: DeepFeat/pr-governance — review.yml, auto-label.yml,</w:t>
-      </w:r>
-      <w:r>
-        <w:t xml:space="preserve"> </w:t>
-      </w:r>
-      <w:r>
-        <w:t xml:space="preserve">monthly-retro.yml</w:t>
-      </w:r>
-    </w:p>
-    <w:p>
-      <w:pPr>
-        <w:numPr>
-          <w:ilvl w:val="0"/>
-          <w:numId w:val="1001"/>
-        </w:numPr>
-        <w:pStyle w:val="Compact"/>
-      </w:pPr>
-      <w:r>
-        <w:t xml:space="preserve">Organization-wide branch protection: GitHub organization ruleset</w:t>
-      </w:r>
-      <w:r>
-        <w:t xml:space="preserve"> </w:t>
-      </w:r>
-      <w:r>
-        <w:t xml:space="preserve">“</w:t>
-      </w:r>
-      <w:r>
-        <w:t xml:space="preserve">Org-Level SOC 2 Protect Main</w:t>
-      </w:r>
-      <w:r>
-        <w:t xml:space="preserve">”</w:t>
+        <w:t xml:space="preserve">Responsibility</w:t>
+      </w:r>
+    </w:p>
+    <w:p>
+      <w:pPr>
+        <w:pStyle w:val="FirstParagraph"/>
+      </w:pPr>
+      <w:r>
+        <w:t xml:space="preserve">It is the Chief Technology Officer’s responsibility to ensure this policy</w:t>
+      </w:r>
+      <w:r>
+        <w:t xml:space="preserve"> </w:t>
+      </w:r>
+      <w:r>
+        <w:t xml:space="preserve">is followed.</w:t>
       </w:r>
     </w:p>
     <w:bookmarkEnd w:id="29"/>
-    <w:bookmarkStart w:id="30" w:name="responsibility"/>
-    <w:p>
-      <w:pPr>
-        <w:pStyle w:val="Heading2"/>
-      </w:pPr>
-      <w:r>
-        <w:t xml:space="preserve">Responsibility</w:t>
-      </w:r>
-    </w:p>
-    <w:p>
-      <w:pPr>
-        <w:pStyle w:val="FirstParagraph"/>
-      </w:pPr>
-      <w:r>
-        <w:t xml:space="preserve">It is the Chief Technology Officer’s responsibility to ensure this policy</w:t>
-      </w:r>
-      <w:r>
-        <w:t xml:space="preserve"> </w:t>
-      </w:r>
-      <w:r>
-        <w:t xml:space="preserve">is followed.</w:t>
-      </w:r>
-    </w:p>
-    <w:bookmarkEnd w:id="30"/>
-    <w:bookmarkStart w:id="31" w:name="version"/>
+    <w:bookmarkStart w:id="30" w:name="version"/>
     <w:p>
       <w:pPr>
         <w:pStyle w:val="Heading2"/>
@@ -834,8 +769,8 @@
         </w:tc>
       </w:tr>
     </w:tbl>
+    <w:bookmarkEnd w:id="30"/>
     <w:bookmarkEnd w:id="31"/>
-    <w:bookmarkEnd w:id="32"/>
     <w:sectPr>
       <w:footerReference r:id="rId9" w:type="default"/>
       <w:pgMar w:bottom="1440" w:left="1440" w:right="1440" w:top="1440"/>
@@ -966,87 +901,8 @@
       </w:pPr>
     </w:lvl>
   </w:abstractNum>
-  <w:abstractNum w:abstractNumId="991">
-    <w:nsid w:val="A991"/>
-    <w:multiLevelType w:val="multilevel"/>
-    <w:lvl w:ilvl="0">
-      <w:numFmt w:val="bullet"/>
-      <w:lvlText w:val="•"/>
-      <w:lvlJc w:val="left"/>
-      <w:pPr>
-        <w:ind w:left="720" w:hanging="480"/>
-      </w:pPr>
-    </w:lvl>
-    <w:lvl w:ilvl="1">
-      <w:numFmt w:val="bullet"/>
-      <w:lvlText w:val="–"/>
-      <w:lvlJc w:val="left"/>
-      <w:pPr>
-        <w:ind w:left="1440" w:hanging="480"/>
-      </w:pPr>
-    </w:lvl>
-    <w:lvl w:ilvl="2">
-      <w:numFmt w:val="bullet"/>
-      <w:lvlText w:val="•"/>
-      <w:lvlJc w:val="left"/>
-      <w:pPr>
-        <w:ind w:left="2160" w:hanging="480"/>
-      </w:pPr>
-    </w:lvl>
-    <w:lvl w:ilvl="3">
-      <w:numFmt w:val="bullet"/>
-      <w:lvlText w:val="–"/>
-      <w:lvlJc w:val="left"/>
-      <w:pPr>
-        <w:ind w:left="2880" w:hanging="480"/>
-      </w:pPr>
-    </w:lvl>
-    <w:lvl w:ilvl="4">
-      <w:numFmt w:val="bullet"/>
-      <w:lvlText w:val="•"/>
-      <w:lvlJc w:val="left"/>
-      <w:pPr>
-        <w:ind w:left="3600" w:hanging="480"/>
-      </w:pPr>
-    </w:lvl>
-    <w:lvl w:ilvl="5">
-      <w:numFmt w:val="bullet"/>
-      <w:lvlText w:val="–"/>
-      <w:lvlJc w:val="left"/>
-      <w:pPr>
-        <w:ind w:left="4320" w:hanging="480"/>
-      </w:pPr>
-    </w:lvl>
-    <w:lvl w:ilvl="6">
-      <w:numFmt w:val="bullet"/>
-      <w:lvlText w:val="•"/>
-      <w:lvlJc w:val="left"/>
-      <w:pPr>
-        <w:ind w:left="5040" w:hanging="480"/>
-      </w:pPr>
-    </w:lvl>
-    <w:lvl w:ilvl="7">
-      <w:numFmt w:val="bullet"/>
-      <w:lvlText w:val="–"/>
-      <w:lvlJc w:val="left"/>
-      <w:pPr>
-        <w:ind w:left="5760" w:hanging="480"/>
-      </w:pPr>
-    </w:lvl>
-    <w:lvl w:ilvl="8">
-      <w:numFmt w:val="bullet"/>
-      <w:lvlText w:val="•"/>
-      <w:lvlJc w:val="left"/>
-      <w:pPr>
-        <w:ind w:left="6480" w:hanging="480"/>
-      </w:pPr>
-    </w:lvl>
-  </w:abstractNum>
   <w:num w:numId="1000">
     <w:abstractNumId w:val="990"/>
-  </w:num>
-  <w:num w:numId="1001">
-    <w:abstractNumId w:val="991"/>
   </w:num>
 </w:numbering>
 </file>

</xml_diff>